<commit_message>
Update Fleet Control Design Document.docx
</commit_message>
<xml_diff>
--- a/Fleet Control Design Document.docx
+++ b/Fleet Control Design Document.docx
@@ -7347,7 +7347,6 @@
           <w:color w:val="222222"/>
           <w:sz w:val="21"/>
         </w:rPr>
-        <w:lastRenderedPageBreak/>
         <w:t>ANSI/ISO/IEC 25010: Systems and Software Engineering – Systems and Software Quality Requirements and Evaluation (</w:t>
       </w:r>
       <w:proofErr w:type="spellStart"/>
@@ -7387,6 +7386,7 @@
           <w:color w:val="222222"/>
           <w:sz w:val="21"/>
         </w:rPr>
+        <w:lastRenderedPageBreak/>
         <w:t>ISO (International Organization for Standardization)</w:t>
       </w:r>
       <w:r>
@@ -8051,7 +8051,6 @@
         <w:rPr>
           <w:color w:val="000000"/>
         </w:rPr>
-        <w:lastRenderedPageBreak/>
         <w:t>Software Quality Assurance Plan [version]</w:t>
       </w:r>
     </w:p>
@@ -8064,6 +8063,7 @@
         </w:numPr>
       </w:pPr>
       <w:r>
+        <w:lastRenderedPageBreak/>
         <w:t>Methodology, Tools, and Techniques</w:t>
       </w:r>
     </w:p>
@@ -10102,7 +10102,6 @@
         <w:ind w:left="1134"/>
       </w:pPr>
       <w:r>
-        <w:lastRenderedPageBreak/>
         <w:t>Synonyms</w:t>
       </w:r>
     </w:p>
@@ -10115,6 +10114,7 @@
         <w:ind w:left="720"/>
       </w:pPr>
       <w:r>
+        <w:lastRenderedPageBreak/>
         <w:t>2) Range or enumeration of possible values (e.g. 0-99)</w:t>
       </w:r>
     </w:p>
@@ -10429,7 +10429,6 @@
         <w:ind w:left="720"/>
       </w:pPr>
       <w:r>
-        <w:lastRenderedPageBreak/>
         <w:t>3) Legality checks, error control</w:t>
       </w:r>
     </w:p>
@@ -10442,6 +10441,7 @@
         <w:ind w:left="720"/>
       </w:pPr>
       <w:r>
+        <w:lastRenderedPageBreak/>
         <w:t>4) Recovery procedures</w:t>
       </w:r>
     </w:p>
@@ -10752,6 +10752,9 @@
       </w:r>
     </w:p>
     <w:p>
+      <w:pPr>
+        <w:keepNext/>
+      </w:pPr>
       <w:r>
         <w:rPr>
           <w:noProof/>
@@ -10800,6 +10803,35 @@
         </w:drawing>
       </w:r>
     </w:p>
+    <w:p>
+      <w:pPr>
+        <w:pStyle w:val="Caption"/>
+      </w:pPr>
+      <w:r>
+        <w:t xml:space="preserve">Figure </w:t>
+      </w:r>
+      <w:r>
+        <w:fldChar w:fldCharType="begin"/>
+      </w:r>
+      <w:r>
+        <w:instrText xml:space="preserve"> SEQ Figure \* ARABIC </w:instrText>
+      </w:r>
+      <w:r>
+        <w:fldChar w:fldCharType="separate"/>
+      </w:r>
+      <w:r>
+        <w:rPr>
+          <w:noProof/>
+        </w:rPr>
+        <w:t>1</w:t>
+      </w:r>
+      <w:r>
+        <w:fldChar w:fldCharType="end"/>
+      </w:r>
+      <w:r>
+        <w:t>: FleetControl User Sign in Use Case</w:t>
+      </w:r>
+    </w:p>
     <w:p/>
     <w:p>
       <w:pPr>
@@ -11122,6 +11154,7 @@
         </w:numPr>
       </w:pPr>
       <w:r>
+        <w:lastRenderedPageBreak/>
         <w:t>User may retry or select Forgot Password.</w:t>
       </w:r>
     </w:p>
@@ -11133,7 +11166,6 @@
         </w:numPr>
       </w:pPr>
       <w:r>
-        <w:lastRenderedPageBreak/>
         <w:t>Unknown Username/Email</w:t>
       </w:r>
     </w:p>
@@ -11482,7 +11514,87 @@
         <w:t>All authentication events are auditable.</w:t>
       </w:r>
     </w:p>
-    <w:p/>
+    <w:p>
+      <w:pPr>
+        <w:keepNext/>
+      </w:pPr>
+      <w:r>
+        <w:rPr>
+          <w:noProof/>
+        </w:rPr>
+        <w:lastRenderedPageBreak/>
+        <w:drawing>
+          <wp:inline distT="0" distB="0" distL="0" distR="0" wp14:anchorId="77A5F3CC" wp14:editId="123F6D15">
+            <wp:extent cx="5943600" cy="3343275"/>
+            <wp:effectExtent l="0" t="0" r="0" b="9525"/>
+            <wp:docPr id="1299829999" name="Picture 3"/>
+            <wp:cNvGraphicFramePr>
+              <a:graphicFrameLocks xmlns:a="http://schemas.openxmlformats.org/drawingml/2006/main" noChangeAspect="1"/>
+            </wp:cNvGraphicFramePr>
+            <a:graphic xmlns:a="http://schemas.openxmlformats.org/drawingml/2006/main">
+              <a:graphicData uri="http://schemas.openxmlformats.org/drawingml/2006/picture">
+                <pic:pic xmlns:pic="http://schemas.openxmlformats.org/drawingml/2006/picture">
+                  <pic:nvPicPr>
+                    <pic:cNvPr id="1299829999" name="Picture 1299829999"/>
+                    <pic:cNvPicPr/>
+                  </pic:nvPicPr>
+                  <pic:blipFill>
+                    <a:blip r:embed="rId16" cstate="print">
+                      <a:extLst>
+                        <a:ext uri="{28A0092B-C50C-407E-A947-70E740481C1C}">
+                          <a14:useLocalDpi xmlns:a14="http://schemas.microsoft.com/office/drawing/2010/main" val="0"/>
+                        </a:ext>
+                      </a:extLst>
+                    </a:blip>
+                    <a:stretch>
+                      <a:fillRect/>
+                    </a:stretch>
+                  </pic:blipFill>
+                  <pic:spPr>
+                    <a:xfrm>
+                      <a:off x="0" y="0"/>
+                      <a:ext cx="5943600" cy="3343275"/>
+                    </a:xfrm>
+                    <a:prstGeom prst="rect">
+                      <a:avLst/>
+                    </a:prstGeom>
+                  </pic:spPr>
+                </pic:pic>
+              </a:graphicData>
+            </a:graphic>
+          </wp:inline>
+        </w:drawing>
+      </w:r>
+    </w:p>
+    <w:p>
+      <w:pPr>
+        <w:pStyle w:val="Caption"/>
+      </w:pPr>
+      <w:r>
+        <w:t xml:space="preserve">Figure </w:t>
+      </w:r>
+      <w:r>
+        <w:fldChar w:fldCharType="begin"/>
+      </w:r>
+      <w:r>
+        <w:instrText xml:space="preserve"> SEQ Figure \* ARABIC </w:instrText>
+      </w:r>
+      <w:r>
+        <w:fldChar w:fldCharType="separate"/>
+      </w:r>
+      <w:r>
+        <w:rPr>
+          <w:noProof/>
+        </w:rPr>
+        <w:t>2</w:t>
+      </w:r>
+      <w:r>
+        <w:fldChar w:fldCharType="end"/>
+      </w:r>
+      <w:r>
+        <w:t>: FleetControl Login Screen</w:t>
+      </w:r>
+    </w:p>
     <w:p>
       <w:pPr>
         <w:pStyle w:val="Heading3"/>
@@ -11492,7 +11604,6 @@
         </w:numPr>
       </w:pPr>
       <w:r>
-        <w:lastRenderedPageBreak/>
         <w:t>Screen [x.1]</w:t>
       </w:r>
     </w:p>
@@ -12214,10 +12325,10 @@
       </w:r>
     </w:p>
     <w:sectPr>
-      <w:headerReference w:type="even" r:id="rId16"/>
-      <w:headerReference w:type="default" r:id="rId17"/>
-      <w:footerReference w:type="even" r:id="rId18"/>
-      <w:footerReference w:type="default" r:id="rId19"/>
+      <w:headerReference w:type="even" r:id="rId17"/>
+      <w:headerReference w:type="default" r:id="rId18"/>
+      <w:footerReference w:type="even" r:id="rId19"/>
+      <w:footerReference w:type="default" r:id="rId20"/>
       <w:pgSz w:w="12240" w:h="15840"/>
       <w:pgMar w:top="1440" w:right="1440" w:bottom="1418" w:left="1440" w:header="709" w:footer="709" w:gutter="0"/>
       <w:cols w:space="720"/>
@@ -12556,7 +12667,7 @@
         <w:sz w:val="16"/>
         <w:szCs w:val="16"/>
       </w:rPr>
-      <w:t xml:space="preserve">  Design Document                       Page </w:t>
+      <w:t xml:space="preserve">  Design Document                 Page </w:t>
     </w:r>
     <w:r>
       <w:rPr>
@@ -12664,7 +12775,7 @@
         <w:sz w:val="16"/>
         <w:szCs w:val="16"/>
       </w:rPr>
-      <w:t xml:space="preserve">                              © Paul M. Summitt 2025. All rights reserved.</w:t>
+      <w:t xml:space="preserve">                      © Paul M. Summitt 2025. All rights reserved.</w:t>
     </w:r>
     <w:r>
       <w:rPr>
@@ -12898,7 +13009,20 @@
         <w:rFonts w:ascii="Helvetica Neue" w:eastAsia="Helvetica Neue" w:hAnsi="Helvetica Neue" w:cs="Helvetica Neue"/>
         <w:color w:val="282282"/>
       </w:rPr>
+      <w:t xml:space="preserve">                    </w:t>
+    </w:r>
+    <w:r>
+      <w:rPr>
+        <w:rFonts w:ascii="Helvetica Neue" w:eastAsia="Helvetica Neue" w:hAnsi="Helvetica Neue" w:cs="Helvetica Neue"/>
+        <w:color w:val="282282"/>
+      </w:rPr>
       <w:tab/>
+    </w:r>
+    <w:r>
+      <w:rPr>
+        <w:rFonts w:ascii="Helvetica Neue" w:eastAsia="Helvetica Neue" w:hAnsi="Helvetica Neue" w:cs="Helvetica Neue"/>
+        <w:color w:val="282282"/>
+      </w:rPr>
       <w:t>Design Document</w:t>
     </w:r>
     <w:r>
@@ -12906,14 +13030,13 @@
         <w:rFonts w:ascii="Helvetica Neue" w:eastAsia="Helvetica Neue" w:hAnsi="Helvetica Neue" w:cs="Helvetica Neue"/>
         <w:color w:val="282282"/>
       </w:rPr>
-      <w:tab/>
+      <w:t xml:space="preserve">: </w:t>
     </w:r>
     <w:r>
       <w:rPr>
         <w:rFonts w:ascii="Helvetica Neue" w:eastAsia="Helvetica Neue" w:hAnsi="Helvetica Neue" w:cs="Helvetica Neue"/>
         <w:color w:val="282282"/>
       </w:rPr>
-      <w:br/>
       <w:t>FleetControl</w:t>
     </w:r>
     <w:r>
@@ -12921,7 +13044,13 @@
         <w:rFonts w:ascii="Helvetica Neue" w:eastAsia="Helvetica Neue" w:hAnsi="Helvetica Neue" w:cs="Helvetica Neue"/>
         <w:color w:val="282282"/>
       </w:rPr>
-      <w:tab/>
+      <w:t xml:space="preserve"> </w:t>
+    </w:r>
+    <w:r>
+      <w:rPr>
+        <w:rFonts w:ascii="Helvetica Neue" w:eastAsia="Helvetica Neue" w:hAnsi="Helvetica Neue" w:cs="Helvetica Neue"/>
+        <w:color w:val="282282"/>
+      </w:rPr>
       <w:t>0.</w:t>
     </w:r>
     <w:r>

</xml_diff>